<commit_message>
tests: build-247 suite + sweep now expands collapsed cards  - test-lead-admin.mjs (new, 20 assertions): lead admin pinned first /   badged / un-removable from every call path, and the Reset Auction   relocation (header empty, one button, bottom card, identical flow).   Honesty checks prove every protection absent in build 246. - test-backup-restore.mjs: header slice no longer keys off the moved   Reset button (stale-window fix). - sweep/driver.mjs: clicks "Expand all" on Controls before sweeping so   controls inside collapsed cards can never silently escape coverage.
</commit_message>
<xml_diff>
--- a/GROUP-REHEARSAL-RUNBOOK.docx
+++ b/GROUP-REHEARSAL-RUNBOOK.docx
@@ -46,7 +46,7 @@
           <w:sz w:val="22"/>
           <w:szCs w:val="22"/>
         </w:rPr>
-        <w:t xml:space="preserve">This run uses NO testing tools: Rehearsal Mode stays OFF, every phase step takes a real cloud backup, every Send really e-mails people, and all decisions are made by hand. That is the point — it is the final proof before launch.</w:t>
+        <w:t xml:space="preserve">This run uses NO testing tools: Rehearsal Mode stays OFF, every phase step takes a real cloud backup, every Send really e-mails people, and decisions use the standard admin tools — no rehearsal-only shortcuts. That is the point — it is the final proof before launch.</w:t>
       </w:r>
     </w:p>
     <w:p>
@@ -531,7 +531,7 @@
                 <w:sz w:val="21"/>
                 <w:szCs w:val="21"/>
               </w:rPr>
-              <w:t xml:space="preserve">1 bid</w:t>
+              <w:t xml:space="preserve">up to 2 bids</w:t>
             </w:r>
           </w:p>
         </w:tc>
@@ -555,7 +555,7 @@
                 <w:sz w:val="21"/>
                 <w:szCs w:val="21"/>
               </w:rPr>
-              <w:t xml:space="preserve">0:15 – 0:27</w:t>
+              <w:t xml:space="preserve">0:15 – 0:25</w:t>
             </w:r>
           </w:p>
         </w:tc>
@@ -599,7 +599,7 @@
                 <w:sz w:val="21"/>
                 <w:szCs w:val="21"/>
               </w:rPr>
-              <w:t xml:space="preserve">up to 4 bids</w:t>
+              <w:t xml:space="preserve">up to 3 bids</w:t>
             </w:r>
           </w:p>
         </w:tc>
@@ -623,7 +623,7 @@
                 <w:sz w:val="21"/>
                 <w:szCs w:val="21"/>
               </w:rPr>
-              <w:t xml:space="preserve">0:27 – 0:35</w:t>
+              <w:t xml:space="preserve">0:25 – 0:32</w:t>
             </w:r>
           </w:p>
         </w:tc>
@@ -667,7 +667,7 @@
                 <w:sz w:val="21"/>
                 <w:szCs w:val="21"/>
               </w:rPr>
-              <w:t xml:space="preserve">2 bids</w:t>
+              <w:t xml:space="preserve">1 or 2 bids</w:t>
             </w:r>
           </w:p>
         </w:tc>
@@ -691,7 +691,7 @@
                 <w:sz w:val="21"/>
                 <w:szCs w:val="21"/>
               </w:rPr>
-              <w:t xml:space="preserve">0:35 – 0:43</w:t>
+              <w:t xml:space="preserve">0:32 – 0:39</w:t>
             </w:r>
           </w:p>
         </w:tc>
@@ -735,7 +735,7 @@
                 <w:sz w:val="21"/>
                 <w:szCs w:val="21"/>
               </w:rPr>
-              <w:t xml:space="preserve">2 bids</w:t>
+              <w:t xml:space="preserve">1 or 2 bids</w:t>
             </w:r>
           </w:p>
         </w:tc>
@@ -759,7 +759,7 @@
                 <w:sz w:val="21"/>
                 <w:szCs w:val="21"/>
               </w:rPr>
-              <w:t xml:space="preserve">0:43 – 0:45</w:t>
+              <w:t xml:space="preserve">0:39 – 0:45</w:t>
             </w:r>
           </w:p>
         </w:tc>
@@ -938,16 +938,16 @@
           <w:sz w:val="22"/>
           <w:szCs w:val="22"/>
         </w:rPr>
-        <w:t xml:space="preserve">: Approvals/Denials first (the projections make most rows a single obvious click), then Draws &amp; Reviews for ties — announce those rulings out loud; the room enjoys it. </w:t>
-      </w:r>
-      <w:r>
-        <w:rPr>
-          <w:b/>
-          <w:bCs/>
-          <w:sz w:val="22"/>
-          <w:szCs w:val="22"/>
-        </w:rPr>
-        <w:t xml:space="preserve">This is the only step that can eat the clock.</w:t>
+        <w:t xml:space="preserve">: in Approvals/Denials click ✓ Approve All Current Winners, then ✕ Deny All Current Losers (denials recompute one at a time, so any bid the engine promotes mid-way is skipped automatically). Then resolve the remaining Draws &amp; Reviews by hand — announce those rulings out loud; the room enjoys it. </w:t>
+      </w:r>
+      <w:r>
+        <w:rPr>
+          <w:b/>
+          <w:bCs/>
+          <w:sz w:val="22"/>
+          <w:szCs w:val="22"/>
+        </w:rPr>
+        <w:t xml:space="preserve">Draws &amp; Reviews are the only step that can eat the clock.</w:t>
       </w:r>
     </w:p>
     <w:p>
@@ -1044,14 +1044,14 @@
           <w:sz w:val="22"/>
           <w:szCs w:val="22"/>
         </w:rPr>
-        <w:t xml:space="preserve">Manual decisions are the time sink.</w:t>
-      </w:r>
-      <w:r>
-        <w:rPr>
-          <w:sz w:val="22"/>
-          <w:szCs w:val="22"/>
-        </w:rPr>
-        <w:t xml:space="preserve"> With Rehearsal Mode OFF there is no auto-decider. Phase 2 at 4 bids × 36 people ≈ 140+ decisions. If the room is chatty, cut Phase 2 to 2 bids per person (announce it) or pre-agree that "projections stand" and click straight down the list.</w:t>
+        <w:t xml:space="preserve">Draws &amp; Reviews are the time sink.</w:t>
+      </w:r>
+      <w:r>
+        <w:rPr>
+          <w:sz w:val="22"/>
+          <w:szCs w:val="22"/>
+        </w:rPr>
+        <w:t xml:space="preserve"> The two bulk buttons clear every decided row in seconds — with Rehearsal Mode OFF they are the standard tools, not testing shortcuts. Only ties and reviews need per-week rulings; rule quickly, and remember an admin ruling IS the design.</w:t>
       </w:r>
     </w:p>
     <w:p>
@@ -1068,7 +1068,7 @@
           <w:sz w:val="22"/>
           <w:szCs w:val="22"/>
         </w:rPr>
-        <w:t xml:space="preserve">Each results send takes a few seconds per e-mail. Do not navigate away mid-send; the delivery ledger warns you if it could not record an address.</w:t>
+        <w:t xml:space="preserve">A full group send is quick — typically 15–45 seconds for the whole department. Stay on the page until the confirmation toast; if a send is ever interrupted, clicking Send again is safe (everyone already delivered-to is skipped).</w:t>
       </w:r>
     </w:p>
     <w:p>

</xml_diff>